<commit_message>
docs(design): tighten assignment flow review layout
</commit_message>
<xml_diff>
--- a/docs/design/reviews/assignment-main-flow-ui-review.docx
+++ b/docs/design/reviews/assignment-main-flow-ui-review.docx
@@ -4,27 +4,27 @@
   <w:body>
     <w:p>
       <w:pPr>
-        <w:spacing w:before="320" w:after="100"/>
+        <w:spacing w:before="200" w:after="100"/>
       </w:pPr>
       <w:r>
         <w:rPr>
           <w:rFonts w:ascii="Calibri" w:hAnsi="Calibri"/>
           <w:b/>
           <w:color w:val="0B2545"/>
-          <w:sz w:val="50"/>
+          <w:sz w:val="46"/>
         </w:rPr>
         <w:t>Assignment Main Flow UI Review</w:t>
       </w:r>
     </w:p>
     <w:p>
       <w:pPr>
-        <w:spacing w:after="360"/>
+        <w:spacing w:after="240"/>
       </w:pPr>
       <w:r>
         <w:rPr>
           <w:rFonts w:ascii="Calibri" w:hAnsi="Calibri"/>
           <w:color w:val="5D6B7A"/>
-          <w:sz w:val="26"/>
+          <w:sz w:val="24"/>
         </w:rPr>
         <w:t>Living review record for sandbox-first, functionality-preserving UI refinement</w:t>
       </w:r>
@@ -38,7 +38,7 @@
           <w:rFonts w:ascii="Calibri" w:hAnsi="Calibri"/>
           <w:b/>
           <w:color w:val="0B2545"/>
-          <w:sz w:val="21"/>
+          <w:sz w:val="19"/>
         </w:rPr>
         <w:t xml:space="preserve">Status: </w:t>
       </w:r>
@@ -46,7 +46,7 @@
         <w:rPr>
           <w:rFonts w:ascii="Calibri" w:hAnsi="Calibri"/>
           <w:color w:val="5D6B7A"/>
-          <w:sz w:val="21"/>
+          <w:sz w:val="19"/>
         </w:rPr>
         <w:t>Living review - collaborative step review pending</w:t>
       </w:r>
@@ -60,7 +60,7 @@
           <w:rFonts w:ascii="Calibri" w:hAnsi="Calibri"/>
           <w:b/>
           <w:color w:val="0B2545"/>
-          <w:sz w:val="21"/>
+          <w:sz w:val="19"/>
         </w:rPr>
         <w:t xml:space="preserve">Baseline branch: </w:t>
       </w:r>
@@ -68,7 +68,7 @@
         <w:rPr>
           <w:rFonts w:ascii="Calibri" w:hAnsi="Calibri"/>
           <w:color w:val="5D6B7A"/>
-          <w:sz w:val="21"/>
+          <w:sz w:val="19"/>
         </w:rPr>
         <w:t>codex/assignment-workflow-ui-polish</w:t>
       </w:r>
@@ -82,7 +82,7 @@
           <w:rFonts w:ascii="Calibri" w:hAnsi="Calibri"/>
           <w:b/>
           <w:color w:val="0B2545"/>
-          <w:sz w:val="21"/>
+          <w:sz w:val="19"/>
         </w:rPr>
         <w:t xml:space="preserve">Baseline commit: </w:t>
       </w:r>
@@ -90,7 +90,7 @@
         <w:rPr>
           <w:rFonts w:ascii="Calibri" w:hAnsi="Calibri"/>
           <w:color w:val="5D6B7A"/>
-          <w:sz w:val="21"/>
+          <w:sz w:val="19"/>
         </w:rPr>
         <w:t>23e86f0f</w:t>
       </w:r>
@@ -104,7 +104,7 @@
           <w:rFonts w:ascii="Calibri" w:hAnsi="Calibri"/>
           <w:b/>
           <w:color w:val="0B2545"/>
-          <w:sz w:val="21"/>
+          <w:sz w:val="19"/>
         </w:rPr>
         <w:t xml:space="preserve">Captured: </w:t>
       </w:r>
@@ -112,7 +112,7 @@
         <w:rPr>
           <w:rFonts w:ascii="Calibri" w:hAnsi="Calibri"/>
           <w:color w:val="5D6B7A"/>
-          <w:sz w:val="21"/>
+          <w:sz w:val="19"/>
         </w:rPr>
         <w:t>13 July 2026</w:t>
       </w:r>
@@ -126,7 +126,7 @@
           <w:rFonts w:ascii="Calibri" w:hAnsi="Calibri"/>
           <w:b/>
           <w:color w:val="0B2545"/>
-          <w:sz w:val="21"/>
+          <w:sz w:val="19"/>
         </w:rPr>
         <w:t xml:space="preserve">Scope: </w:t>
       </w:r>
@@ -134,7 +134,7 @@
         <w:rPr>
           <w:rFonts w:ascii="Calibri" w:hAnsi="Calibri"/>
           <w:color w:val="5D6B7A"/>
-          <w:sz w:val="21"/>
+          <w:sz w:val="19"/>
         </w:rPr>
         <w:t>Main assignment flow; visual and copy refinement only</w:t>
       </w:r>
@@ -142,7 +142,7 @@
     <w:p/>
     <w:p>
       <w:pPr>
-        <w:spacing w:before="80" w:after="200" w:line="288" w:lineRule="auto"/>
+        <w:spacing w:before="40" w:after="120" w:line="264" w:lineRule="auto"/>
         <w:ind w:left="173" w:right="173"/>
         <w:shd w:fill="E8EEF5"/>
         <w:pBdr>
@@ -154,7 +154,7 @@
           <w:rFonts w:ascii="Calibri" w:hAnsi="Calibri"/>
           <w:b/>
           <w:color w:val="1F4D78"/>
-          <w:sz w:val="22"/>
+          <w:sz w:val="20"/>
         </w:rPr>
         <w:t xml:space="preserve">Working direction: </w:t>
       </w:r>
@@ -162,7 +162,7 @@
         <w:rPr>
           <w:rFonts w:ascii="Calibri" w:hAnsi="Calibri"/>
           <w:color w:val="0B2545"/>
-          <w:sz w:val="22"/>
+          <w:sz w:val="20"/>
         </w:rPr>
         <w:t>The flow is stable and coherent. The main opportunity is to reduce repeated reassurance, completion messaging, and nested surfaces so each step feels lighter without changing behavior.</w:t>
       </w:r>
@@ -178,7 +178,7 @@
     <w:p>
       <w:pPr>
         <w:pStyle w:val="ListBullet"/>
-        <w:spacing w:after="80" w:line="300" w:lineRule="auto"/>
+        <w:spacing w:after="40" w:line="276" w:lineRule="auto"/>
         <w:ind w:left="540" w:hanging="271"/>
       </w:pPr>
       <w:r>
@@ -192,7 +192,7 @@
     <w:p>
       <w:pPr>
         <w:pStyle w:val="ListBullet"/>
-        <w:spacing w:after="80" w:line="300" w:lineRule="auto"/>
+        <w:spacing w:after="40" w:line="276" w:lineRule="auto"/>
         <w:ind w:left="540" w:hanging="271"/>
       </w:pPr>
       <w:r>
@@ -206,7 +206,7 @@
     <w:p>
       <w:pPr>
         <w:pStyle w:val="ListBullet"/>
-        <w:spacing w:after="80" w:line="300" w:lineRule="auto"/>
+        <w:spacing w:after="40" w:line="276" w:lineRule="auto"/>
         <w:ind w:left="540" w:hanging="271"/>
       </w:pPr>
       <w:r>
@@ -220,7 +220,7 @@
     <w:p>
       <w:pPr>
         <w:pStyle w:val="ListBullet"/>
-        <w:spacing w:after="80" w:line="300" w:lineRule="auto"/>
+        <w:spacing w:after="40" w:line="276" w:lineRule="auto"/>
         <w:ind w:left="540" w:hanging="271"/>
       </w:pPr>
       <w:r>
@@ -234,7 +234,7 @@
     <w:p>
       <w:pPr>
         <w:pStyle w:val="ListBullet"/>
-        <w:spacing w:after="80" w:line="300" w:lineRule="auto"/>
+        <w:spacing w:after="40" w:line="276" w:lineRule="auto"/>
         <w:ind w:left="540" w:hanging="271"/>
       </w:pPr>
       <w:r>
@@ -256,7 +256,7 @@
     <w:p>
       <w:pPr>
         <w:pStyle w:val="ListBullet"/>
-        <w:spacing w:after="80" w:line="300" w:lineRule="auto"/>
+        <w:spacing w:after="40" w:line="276" w:lineRule="auto"/>
         <w:ind w:left="540" w:hanging="271"/>
       </w:pPr>
       <w:r>
@@ -270,7 +270,7 @@
     <w:p>
       <w:pPr>
         <w:pStyle w:val="ListBullet"/>
-        <w:spacing w:after="80" w:line="300" w:lineRule="auto"/>
+        <w:spacing w:after="40" w:line="276" w:lineRule="auto"/>
         <w:ind w:left="540" w:hanging="271"/>
       </w:pPr>
       <w:r>
@@ -284,7 +284,7 @@
     <w:p>
       <w:pPr>
         <w:pStyle w:val="ListBullet"/>
-        <w:spacing w:after="80" w:line="300" w:lineRule="auto"/>
+        <w:spacing w:after="40" w:line="276" w:lineRule="auto"/>
         <w:ind w:left="540" w:hanging="271"/>
       </w:pPr>
       <w:r>
@@ -298,7 +298,7 @@
     <w:p>
       <w:pPr>
         <w:pStyle w:val="ListBullet"/>
-        <w:spacing w:after="80" w:line="300" w:lineRule="auto"/>
+        <w:spacing w:after="40" w:line="276" w:lineRule="auto"/>
         <w:ind w:left="540" w:hanging="271"/>
       </w:pPr>
       <w:r>
@@ -312,7 +312,7 @@
     <w:p>
       <w:pPr>
         <w:pStyle w:val="ListBullet"/>
-        <w:spacing w:after="80" w:line="300" w:lineRule="auto"/>
+        <w:spacing w:after="40" w:line="276" w:lineRule="auto"/>
         <w:ind w:left="540" w:hanging="271"/>
       </w:pPr>
       <w:r>
@@ -334,7 +334,7 @@
     <w:p>
       <w:pPr>
         <w:pStyle w:val="ListNumber"/>
-        <w:spacing w:after="80" w:line="300" w:lineRule="auto"/>
+        <w:spacing w:after="40" w:line="276" w:lineRule="auto"/>
         <w:ind w:left="540" w:hanging="271"/>
       </w:pPr>
       <w:r>
@@ -348,7 +348,7 @@
     <w:p>
       <w:pPr>
         <w:pStyle w:val="ListNumber"/>
-        <w:spacing w:after="80" w:line="300" w:lineRule="auto"/>
+        <w:spacing w:after="40" w:line="276" w:lineRule="auto"/>
         <w:ind w:left="540" w:hanging="271"/>
       </w:pPr>
       <w:r>
@@ -362,7 +362,7 @@
     <w:p>
       <w:pPr>
         <w:pStyle w:val="ListNumber"/>
-        <w:spacing w:after="80" w:line="300" w:lineRule="auto"/>
+        <w:spacing w:after="40" w:line="276" w:lineRule="auto"/>
         <w:ind w:left="540" w:hanging="271"/>
       </w:pPr>
       <w:r>
@@ -376,7 +376,7 @@
     <w:p>
       <w:pPr>
         <w:pStyle w:val="ListNumber"/>
-        <w:spacing w:after="80" w:line="300" w:lineRule="auto"/>
+        <w:spacing w:after="40" w:line="276" w:lineRule="auto"/>
         <w:ind w:left="540" w:hanging="271"/>
       </w:pPr>
       <w:r>
@@ -390,7 +390,7 @@
     <w:p>
       <w:pPr>
         <w:pStyle w:val="ListNumber"/>
-        <w:spacing w:after="80" w:line="300" w:lineRule="auto"/>
+        <w:spacing w:after="40" w:line="276" w:lineRule="auto"/>
         <w:ind w:left="540" w:hanging="271"/>
       </w:pPr>
       <w:r>
@@ -412,7 +412,7 @@
     <w:p>
       <w:pPr>
         <w:pStyle w:val="ListBullet"/>
-        <w:spacing w:after="80" w:line="300" w:lineRule="auto"/>
+        <w:spacing w:after="40" w:line="276" w:lineRule="auto"/>
         <w:ind w:left="540" w:hanging="271"/>
       </w:pPr>
       <w:r>
@@ -426,7 +426,7 @@
     <w:p>
       <w:pPr>
         <w:pStyle w:val="ListBullet"/>
-        <w:spacing w:after="80" w:line="300" w:lineRule="auto"/>
+        <w:spacing w:after="40" w:line="276" w:lineRule="auto"/>
         <w:ind w:left="540" w:hanging="271"/>
       </w:pPr>
       <w:r>
@@ -440,7 +440,7 @@
     <w:p>
       <w:pPr>
         <w:pStyle w:val="ListBullet"/>
-        <w:spacing w:after="80" w:line="300" w:lineRule="auto"/>
+        <w:spacing w:after="40" w:line="276" w:lineRule="auto"/>
         <w:ind w:left="540" w:hanging="271"/>
       </w:pPr>
       <w:r>
@@ -467,7 +467,7 @@
     </w:p>
     <w:p>
       <w:pPr>
-        <w:spacing w:before="80" w:after="200" w:line="288" w:lineRule="auto"/>
+        <w:spacing w:before="40" w:after="120" w:line="264" w:lineRule="auto"/>
         <w:ind w:left="173" w:right="173"/>
         <w:shd w:fill="E8EEF5"/>
         <w:pBdr>
@@ -479,7 +479,7 @@
           <w:rFonts w:ascii="Calibri" w:hAnsi="Calibri"/>
           <w:b/>
           <w:color w:val="1F4D78"/>
-          <w:sz w:val="22"/>
+          <w:sz w:val="20"/>
         </w:rPr>
         <w:t xml:space="preserve">Initial verdict: </w:t>
       </w:r>
@@ -487,7 +487,7 @@
         <w:rPr>
           <w:rFonts w:ascii="Calibri" w:hAnsi="Calibri"/>
           <w:color w:val="0B2545"/>
-          <w:sz w:val="22"/>
+          <w:sz w:val="20"/>
         </w:rPr>
         <w:t>The step is understandable, but completed setup choices occupy more space than the actual student-selection task.</w:t>
       </w:r>
@@ -500,7 +500,7 @@
       <w:r>
         <w:drawing>
           <wp:inline xmlns:a="http://schemas.openxmlformats.org/drawingml/2006/main" xmlns:pic="http://schemas.openxmlformats.org/drawingml/2006/picture">
-            <wp:extent cx="5623560" cy="4306801"/>
+            <wp:extent cx="4572000" cy="3501464"/>
             <wp:docPr id="1" name="Picture 1" descr="Sandbox screenshot of assignment builder step 1, Student." title="Current sandbox baseline - Step 1: Student"/>
             <wp:cNvGraphicFramePr>
               <a:graphicFrameLocks noChangeAspect="1"/>
@@ -521,7 +521,7 @@
                   <pic:spPr>
                     <a:xfrm>
                       <a:off x="0" y="0"/>
-                      <a:ext cx="5623560" cy="4306801"/>
+                      <a:ext cx="4572000" cy="3501464"/>
                     </a:xfrm>
                     <a:prstGeom prst="rect"/>
                   </pic:spPr>
@@ -534,7 +534,7 @@
     </w:p>
     <w:p>
       <w:pPr>
-        <w:spacing w:after="160"/>
+        <w:spacing w:after="80"/>
         <w:jc w:val="center"/>
       </w:pPr>
       <w:r>
@@ -542,7 +542,7 @@
           <w:rFonts w:ascii="Calibri" w:hAnsi="Calibri"/>
           <w:i/>
           <w:color w:val="5D6B7A"/>
-          <w:sz w:val="18"/>
+          <w:sz w:val="17"/>
         </w:rPr>
         <w:t>Current sandbox baseline - Step 1: Student</w:t>
       </w:r>
@@ -558,7 +558,7 @@
     <w:p>
       <w:pPr>
         <w:pStyle w:val="ListBullet"/>
-        <w:spacing w:after="80" w:line="300" w:lineRule="auto"/>
+        <w:spacing w:after="40" w:line="276" w:lineRule="auto"/>
         <w:ind w:left="540" w:hanging="271"/>
       </w:pPr>
       <w:r>
@@ -572,7 +572,7 @@
     <w:p>
       <w:pPr>
         <w:pStyle w:val="ListBullet"/>
-        <w:spacing w:after="80" w:line="300" w:lineRule="auto"/>
+        <w:spacing w:after="40" w:line="276" w:lineRule="auto"/>
         <w:ind w:left="540" w:hanging="271"/>
       </w:pPr>
       <w:r>
@@ -586,7 +586,7 @@
     <w:p>
       <w:pPr>
         <w:pStyle w:val="ListBullet"/>
-        <w:spacing w:after="80" w:line="300" w:lineRule="auto"/>
+        <w:spacing w:after="40" w:line="276" w:lineRule="auto"/>
         <w:ind w:left="540" w:hanging="271"/>
       </w:pPr>
       <w:r>
@@ -600,7 +600,7 @@
     <w:p>
       <w:pPr>
         <w:pStyle w:val="ListBullet"/>
-        <w:spacing w:after="80" w:line="300" w:lineRule="auto"/>
+        <w:spacing w:after="40" w:line="276" w:lineRule="auto"/>
         <w:ind w:left="540" w:hanging="271"/>
       </w:pPr>
       <w:r>
@@ -622,7 +622,7 @@
     <w:p>
       <w:pPr>
         <w:pStyle w:val="ListBullet"/>
-        <w:spacing w:after="80" w:line="300" w:lineRule="auto"/>
+        <w:spacing w:after="40" w:line="276" w:lineRule="auto"/>
         <w:ind w:left="540" w:hanging="271"/>
       </w:pPr>
       <w:r>
@@ -636,7 +636,7 @@
     <w:p>
       <w:pPr>
         <w:pStyle w:val="ListBullet"/>
-        <w:spacing w:after="80" w:line="300" w:lineRule="auto"/>
+        <w:spacing w:after="40" w:line="276" w:lineRule="auto"/>
         <w:ind w:left="540" w:hanging="271"/>
       </w:pPr>
       <w:r>
@@ -650,7 +650,7 @@
     <w:p>
       <w:pPr>
         <w:pStyle w:val="ListBullet"/>
-        <w:spacing w:after="80" w:line="300" w:lineRule="auto"/>
+        <w:spacing w:after="40" w:line="276" w:lineRule="auto"/>
         <w:ind w:left="540" w:hanging="271"/>
       </w:pPr>
       <w:r>
@@ -672,7 +672,7 @@
     <w:p>
       <w:pPr>
         <w:pStyle w:val="ListBullet"/>
-        <w:spacing w:after="80" w:line="300" w:lineRule="auto"/>
+        <w:spacing w:after="40" w:line="276" w:lineRule="auto"/>
         <w:ind w:left="540" w:hanging="271"/>
       </w:pPr>
       <w:r>
@@ -686,7 +686,7 @@
     <w:p>
       <w:pPr>
         <w:pStyle w:val="ListBullet"/>
-        <w:spacing w:after="80" w:line="300" w:lineRule="auto"/>
+        <w:spacing w:after="40" w:line="276" w:lineRule="auto"/>
         <w:ind w:left="540" w:hanging="271"/>
       </w:pPr>
       <w:r>
@@ -700,7 +700,7 @@
     <w:p>
       <w:pPr>
         <w:pStyle w:val="ListBullet"/>
-        <w:spacing w:after="80" w:line="300" w:lineRule="auto"/>
+        <w:spacing w:after="40" w:line="276" w:lineRule="auto"/>
         <w:ind w:left="540" w:hanging="271"/>
       </w:pPr>
       <w:r>
@@ -714,7 +714,7 @@
     <w:p>
       <w:pPr>
         <w:pStyle w:val="ListBullet"/>
-        <w:spacing w:after="80" w:line="300" w:lineRule="auto"/>
+        <w:spacing w:after="40" w:line="276" w:lineRule="auto"/>
         <w:ind w:left="540" w:hanging="271"/>
       </w:pPr>
       <w:r>
@@ -727,14 +727,14 @@
     </w:p>
     <w:p>
       <w:pPr>
-        <w:spacing w:before="160"/>
+        <w:spacing w:before="80"/>
       </w:pPr>
       <w:r>
         <w:rPr>
           <w:rFonts w:ascii="Calibri" w:hAnsi="Calibri"/>
           <w:b/>
           <w:color w:val="1F4D78"/>
-          <w:sz w:val="20"/>
+          <w:sz w:val="19"/>
         </w:rPr>
         <w:t>Review status: queued for collaborative review</w:t>
       </w:r>
@@ -755,7 +755,7 @@
     </w:p>
     <w:p>
       <w:pPr>
-        <w:spacing w:before="80" w:after="200" w:line="288" w:lineRule="auto"/>
+        <w:spacing w:before="40" w:after="120" w:line="264" w:lineRule="auto"/>
         <w:ind w:left="173" w:right="173"/>
         <w:shd w:fill="E8EEF5"/>
         <w:pBdr>
@@ -767,7 +767,7 @@
           <w:rFonts w:ascii="Calibri" w:hAnsi="Calibri"/>
           <w:b/>
           <w:color w:val="1F4D78"/>
-          <w:sz w:val="22"/>
+          <w:sz w:val="20"/>
         </w:rPr>
         <w:t xml:space="preserve">Initial verdict: </w:t>
       </w:r>
@@ -775,7 +775,7 @@
         <w:rPr>
           <w:rFonts w:ascii="Calibri" w:hAnsi="Calibri"/>
           <w:color w:val="0B2545"/>
-          <w:sz w:val="22"/>
+          <w:sz w:val="20"/>
         </w:rPr>
         <w:t>The source choice is clear. Most improvement can come from removing duplicated copy and making transcript content feel less technical.</w:t>
       </w:r>
@@ -788,7 +788,7 @@
       <w:r>
         <w:drawing>
           <wp:inline xmlns:a="http://schemas.openxmlformats.org/drawingml/2006/main" xmlns:pic="http://schemas.openxmlformats.org/drawingml/2006/picture">
-            <wp:extent cx="5623560" cy="4306801"/>
+            <wp:extent cx="4572000" cy="3501464"/>
             <wp:docPr id="2" name="Picture 2" descr="Sandbox screenshot of assignment builder step 2, Lesson source." title="Current sandbox baseline - Step 2: Lesson source"/>
             <wp:cNvGraphicFramePr>
               <a:graphicFrameLocks noChangeAspect="1"/>
@@ -809,7 +809,7 @@
                   <pic:spPr>
                     <a:xfrm>
                       <a:off x="0" y="0"/>
-                      <a:ext cx="5623560" cy="4306801"/>
+                      <a:ext cx="4572000" cy="3501464"/>
                     </a:xfrm>
                     <a:prstGeom prst="rect"/>
                   </pic:spPr>
@@ -822,7 +822,7 @@
     </w:p>
     <w:p>
       <w:pPr>
-        <w:spacing w:after="160"/>
+        <w:spacing w:after="80"/>
         <w:jc w:val="center"/>
       </w:pPr>
       <w:r>
@@ -830,7 +830,7 @@
           <w:rFonts w:ascii="Calibri" w:hAnsi="Calibri"/>
           <w:i/>
           <w:color w:val="5D6B7A"/>
-          <w:sz w:val="18"/>
+          <w:sz w:val="17"/>
         </w:rPr>
         <w:t>Current sandbox baseline - Step 2: Lesson source</w:t>
       </w:r>
@@ -846,7 +846,7 @@
     <w:p>
       <w:pPr>
         <w:pStyle w:val="ListBullet"/>
-        <w:spacing w:after="80" w:line="300" w:lineRule="auto"/>
+        <w:spacing w:after="40" w:line="276" w:lineRule="auto"/>
         <w:ind w:left="540" w:hanging="271"/>
       </w:pPr>
       <w:r>
@@ -860,7 +860,7 @@
     <w:p>
       <w:pPr>
         <w:pStyle w:val="ListBullet"/>
-        <w:spacing w:after="80" w:line="300" w:lineRule="auto"/>
+        <w:spacing w:after="40" w:line="276" w:lineRule="auto"/>
         <w:ind w:left="540" w:hanging="271"/>
       </w:pPr>
       <w:r>
@@ -874,7 +874,7 @@
     <w:p>
       <w:pPr>
         <w:pStyle w:val="ListBullet"/>
-        <w:spacing w:after="80" w:line="300" w:lineRule="auto"/>
+        <w:spacing w:after="40" w:line="276" w:lineRule="auto"/>
         <w:ind w:left="540" w:hanging="271"/>
       </w:pPr>
       <w:r>
@@ -888,7 +888,7 @@
     <w:p>
       <w:pPr>
         <w:pStyle w:val="ListBullet"/>
-        <w:spacing w:after="80" w:line="300" w:lineRule="auto"/>
+        <w:spacing w:after="40" w:line="276" w:lineRule="auto"/>
         <w:ind w:left="540" w:hanging="271"/>
       </w:pPr>
       <w:r>
@@ -910,7 +910,7 @@
     <w:p>
       <w:pPr>
         <w:pStyle w:val="ListBullet"/>
-        <w:spacing w:after="80" w:line="300" w:lineRule="auto"/>
+        <w:spacing w:after="40" w:line="276" w:lineRule="auto"/>
         <w:ind w:left="540" w:hanging="271"/>
       </w:pPr>
       <w:r>
@@ -924,7 +924,7 @@
     <w:p>
       <w:pPr>
         <w:pStyle w:val="ListBullet"/>
-        <w:spacing w:after="80" w:line="300" w:lineRule="auto"/>
+        <w:spacing w:after="40" w:line="276" w:lineRule="auto"/>
         <w:ind w:left="540" w:hanging="271"/>
       </w:pPr>
       <w:r>
@@ -938,7 +938,7 @@
     <w:p>
       <w:pPr>
         <w:pStyle w:val="ListBullet"/>
-        <w:spacing w:after="80" w:line="300" w:lineRule="auto"/>
+        <w:spacing w:after="40" w:line="276" w:lineRule="auto"/>
         <w:ind w:left="540" w:hanging="271"/>
       </w:pPr>
       <w:r>
@@ -960,7 +960,7 @@
     <w:p>
       <w:pPr>
         <w:pStyle w:val="ListBullet"/>
-        <w:spacing w:after="80" w:line="300" w:lineRule="auto"/>
+        <w:spacing w:after="40" w:line="276" w:lineRule="auto"/>
         <w:ind w:left="540" w:hanging="271"/>
       </w:pPr>
       <w:r>
@@ -974,7 +974,7 @@
     <w:p>
       <w:pPr>
         <w:pStyle w:val="ListBullet"/>
-        <w:spacing w:after="80" w:line="300" w:lineRule="auto"/>
+        <w:spacing w:after="40" w:line="276" w:lineRule="auto"/>
         <w:ind w:left="540" w:hanging="271"/>
       </w:pPr>
       <w:r>
@@ -988,7 +988,7 @@
     <w:p>
       <w:pPr>
         <w:pStyle w:val="ListBullet"/>
-        <w:spacing w:after="80" w:line="300" w:lineRule="auto"/>
+        <w:spacing w:after="40" w:line="276" w:lineRule="auto"/>
         <w:ind w:left="540" w:hanging="271"/>
       </w:pPr>
       <w:r>
@@ -1002,7 +1002,7 @@
     <w:p>
       <w:pPr>
         <w:pStyle w:val="ListBullet"/>
-        <w:spacing w:after="80" w:line="300" w:lineRule="auto"/>
+        <w:spacing w:after="40" w:line="276" w:lineRule="auto"/>
         <w:ind w:left="540" w:hanging="271"/>
       </w:pPr>
       <w:r>
@@ -1015,14 +1015,14 @@
     </w:p>
     <w:p>
       <w:pPr>
-        <w:spacing w:before="160"/>
+        <w:spacing w:before="80"/>
       </w:pPr>
       <w:r>
         <w:rPr>
           <w:rFonts w:ascii="Calibri" w:hAnsi="Calibri"/>
           <w:b/>
           <w:color w:val="1F4D78"/>
-          <w:sz w:val="20"/>
+          <w:sz w:val="19"/>
         </w:rPr>
         <w:t>Review status: queued for collaborative review</w:t>
       </w:r>
@@ -1043,7 +1043,7 @@
     </w:p>
     <w:p>
       <w:pPr>
-        <w:spacing w:before="80" w:after="200" w:line="288" w:lineRule="auto"/>
+        <w:spacing w:before="40" w:after="120" w:line="264" w:lineRule="auto"/>
         <w:ind w:left="173" w:right="173"/>
         <w:shd w:fill="E8EEF5"/>
         <w:pBdr>
@@ -1055,7 +1055,7 @@
           <w:rFonts w:ascii="Calibri" w:hAnsi="Calibri"/>
           <w:b/>
           <w:color w:val="1F4D78"/>
-          <w:sz w:val="22"/>
+          <w:sz w:val="20"/>
         </w:rPr>
         <w:t xml:space="preserve">Initial verdict: </w:t>
       </w:r>
@@ -1063,7 +1063,7 @@
         <w:rPr>
           <w:rFonts w:ascii="Calibri" w:hAnsi="Calibri"/>
           <w:color w:val="0B2545"/>
-          <w:sz w:val="22"/>
+          <w:sz w:val="20"/>
         </w:rPr>
         <w:t>The information is useful, but the reference profile dominates the viewport while the teacher's active input sits below it.</w:t>
       </w:r>
@@ -1076,7 +1076,7 @@
       <w:r>
         <w:drawing>
           <wp:inline xmlns:a="http://schemas.openxmlformats.org/drawingml/2006/main" xmlns:pic="http://schemas.openxmlformats.org/drawingml/2006/picture">
-            <wp:extent cx="5623560" cy="4306801"/>
+            <wp:extent cx="4572000" cy="3501464"/>
             <wp:docPr id="3" name="Picture 3" descr="Sandbox screenshot of assignment builder step 3, Teaching context." title="Current sandbox baseline - Step 3: Teaching context"/>
             <wp:cNvGraphicFramePr>
               <a:graphicFrameLocks noChangeAspect="1"/>
@@ -1097,7 +1097,7 @@
                   <pic:spPr>
                     <a:xfrm>
                       <a:off x="0" y="0"/>
-                      <a:ext cx="5623560" cy="4306801"/>
+                      <a:ext cx="4572000" cy="3501464"/>
                     </a:xfrm>
                     <a:prstGeom prst="rect"/>
                   </pic:spPr>
@@ -1110,7 +1110,7 @@
     </w:p>
     <w:p>
       <w:pPr>
-        <w:spacing w:after="160"/>
+        <w:spacing w:after="80"/>
         <w:jc w:val="center"/>
       </w:pPr>
       <w:r>
@@ -1118,7 +1118,7 @@
           <w:rFonts w:ascii="Calibri" w:hAnsi="Calibri"/>
           <w:i/>
           <w:color w:val="5D6B7A"/>
-          <w:sz w:val="18"/>
+          <w:sz w:val="17"/>
         </w:rPr>
         <w:t>Current sandbox baseline - Step 3: Teaching context</w:t>
       </w:r>
@@ -1134,7 +1134,7 @@
     <w:p>
       <w:pPr>
         <w:pStyle w:val="ListBullet"/>
-        <w:spacing w:after="80" w:line="300" w:lineRule="auto"/>
+        <w:spacing w:after="40" w:line="276" w:lineRule="auto"/>
         <w:ind w:left="540" w:hanging="271"/>
       </w:pPr>
       <w:r>
@@ -1148,7 +1148,7 @@
     <w:p>
       <w:pPr>
         <w:pStyle w:val="ListBullet"/>
-        <w:spacing w:after="80" w:line="300" w:lineRule="auto"/>
+        <w:spacing w:after="40" w:line="276" w:lineRule="auto"/>
         <w:ind w:left="540" w:hanging="271"/>
       </w:pPr>
       <w:r>
@@ -1162,7 +1162,7 @@
     <w:p>
       <w:pPr>
         <w:pStyle w:val="ListBullet"/>
-        <w:spacing w:after="80" w:line="300" w:lineRule="auto"/>
+        <w:spacing w:after="40" w:line="276" w:lineRule="auto"/>
         <w:ind w:left="540" w:hanging="271"/>
       </w:pPr>
       <w:r>
@@ -1176,7 +1176,7 @@
     <w:p>
       <w:pPr>
         <w:pStyle w:val="ListBullet"/>
-        <w:spacing w:after="80" w:line="300" w:lineRule="auto"/>
+        <w:spacing w:after="40" w:line="276" w:lineRule="auto"/>
         <w:ind w:left="540" w:hanging="271"/>
       </w:pPr>
       <w:r>
@@ -1198,7 +1198,7 @@
     <w:p>
       <w:pPr>
         <w:pStyle w:val="ListBullet"/>
-        <w:spacing w:after="80" w:line="300" w:lineRule="auto"/>
+        <w:spacing w:after="40" w:line="276" w:lineRule="auto"/>
         <w:ind w:left="540" w:hanging="271"/>
       </w:pPr>
       <w:r>
@@ -1212,7 +1212,7 @@
     <w:p>
       <w:pPr>
         <w:pStyle w:val="ListBullet"/>
-        <w:spacing w:after="80" w:line="300" w:lineRule="auto"/>
+        <w:spacing w:after="40" w:line="276" w:lineRule="auto"/>
         <w:ind w:left="540" w:hanging="271"/>
       </w:pPr>
       <w:r>
@@ -1226,7 +1226,7 @@
     <w:p>
       <w:pPr>
         <w:pStyle w:val="ListBullet"/>
-        <w:spacing w:after="80" w:line="300" w:lineRule="auto"/>
+        <w:spacing w:after="40" w:line="276" w:lineRule="auto"/>
         <w:ind w:left="540" w:hanging="271"/>
       </w:pPr>
       <w:r>
@@ -1248,7 +1248,7 @@
     <w:p>
       <w:pPr>
         <w:pStyle w:val="ListBullet"/>
-        <w:spacing w:after="80" w:line="300" w:lineRule="auto"/>
+        <w:spacing w:after="40" w:line="276" w:lineRule="auto"/>
         <w:ind w:left="540" w:hanging="271"/>
       </w:pPr>
       <w:r>
@@ -1262,7 +1262,7 @@
     <w:p>
       <w:pPr>
         <w:pStyle w:val="ListBullet"/>
-        <w:spacing w:after="80" w:line="300" w:lineRule="auto"/>
+        <w:spacing w:after="40" w:line="276" w:lineRule="auto"/>
         <w:ind w:left="540" w:hanging="271"/>
       </w:pPr>
       <w:r>
@@ -1276,7 +1276,7 @@
     <w:p>
       <w:pPr>
         <w:pStyle w:val="ListBullet"/>
-        <w:spacing w:after="80" w:line="300" w:lineRule="auto"/>
+        <w:spacing w:after="40" w:line="276" w:lineRule="auto"/>
         <w:ind w:left="540" w:hanging="271"/>
       </w:pPr>
       <w:r>
@@ -1290,7 +1290,7 @@
     <w:p>
       <w:pPr>
         <w:pStyle w:val="ListBullet"/>
-        <w:spacing w:after="80" w:line="300" w:lineRule="auto"/>
+        <w:spacing w:after="40" w:line="276" w:lineRule="auto"/>
         <w:ind w:left="540" w:hanging="271"/>
       </w:pPr>
       <w:r>
@@ -1303,14 +1303,14 @@
     </w:p>
     <w:p>
       <w:pPr>
-        <w:spacing w:before="160"/>
+        <w:spacing w:before="80"/>
       </w:pPr>
       <w:r>
         <w:rPr>
           <w:rFonts w:ascii="Calibri" w:hAnsi="Calibri"/>
           <w:b/>
           <w:color w:val="1F4D78"/>
-          <w:sz w:val="20"/>
+          <w:sz w:val="19"/>
         </w:rPr>
         <w:t>Review status: queued for collaborative review</w:t>
       </w:r>
@@ -1331,7 +1331,7 @@
     </w:p>
     <w:p>
       <w:pPr>
-        <w:spacing w:before="80" w:after="200" w:line="288" w:lineRule="auto"/>
+        <w:spacing w:before="40" w:after="120" w:line="264" w:lineRule="auto"/>
         <w:ind w:left="173" w:right="173"/>
         <w:shd w:fill="E8EEF5"/>
         <w:pBdr>
@@ -1343,7 +1343,7 @@
           <w:rFonts w:ascii="Calibri" w:hAnsi="Calibri"/>
           <w:b/>
           <w:color w:val="1F4D78"/>
-          <w:sz w:val="22"/>
+          <w:sz w:val="20"/>
         </w:rPr>
         <w:t xml:space="preserve">Initial verdict: </w:t>
       </w:r>
@@ -1351,7 +1351,7 @@
         <w:rPr>
           <w:rFonts w:ascii="Calibri" w:hAnsi="Calibri"/>
           <w:color w:val="0B2545"/>
-          <w:sz w:val="22"/>
+          <w:sz w:val="20"/>
         </w:rPr>
         <w:t>The editor is clear and appropriately technical. The main ambiguity is whether Generate means first generation or regeneration once content already exists.</w:t>
       </w:r>
@@ -1364,7 +1364,7 @@
       <w:r>
         <w:drawing>
           <wp:inline xmlns:a="http://schemas.openxmlformats.org/drawingml/2006/main" xmlns:pic="http://schemas.openxmlformats.org/drawingml/2006/picture">
-            <wp:extent cx="5623560" cy="4306801"/>
+            <wp:extent cx="4572000" cy="3501464"/>
             <wp:docPr id="4" name="Picture 4" descr="Sandbox screenshot of assignment builder step 4, Create." title="Current sandbox baseline - Step 4: Create"/>
             <wp:cNvGraphicFramePr>
               <a:graphicFrameLocks noChangeAspect="1"/>
@@ -1385,7 +1385,7 @@
                   <pic:spPr>
                     <a:xfrm>
                       <a:off x="0" y="0"/>
-                      <a:ext cx="5623560" cy="4306801"/>
+                      <a:ext cx="4572000" cy="3501464"/>
                     </a:xfrm>
                     <a:prstGeom prst="rect"/>
                   </pic:spPr>
@@ -1398,7 +1398,7 @@
     </w:p>
     <w:p>
       <w:pPr>
-        <w:spacing w:after="160"/>
+        <w:spacing w:after="80"/>
         <w:jc w:val="center"/>
       </w:pPr>
       <w:r>
@@ -1406,7 +1406,7 @@
           <w:rFonts w:ascii="Calibri" w:hAnsi="Calibri"/>
           <w:i/>
           <w:color w:val="5D6B7A"/>
-          <w:sz w:val="18"/>
+          <w:sz w:val="17"/>
         </w:rPr>
         <w:t>Current sandbox baseline - Step 4: Create</w:t>
       </w:r>
@@ -1422,7 +1422,7 @@
     <w:p>
       <w:pPr>
         <w:pStyle w:val="ListBullet"/>
-        <w:spacing w:after="80" w:line="300" w:lineRule="auto"/>
+        <w:spacing w:after="40" w:line="276" w:lineRule="auto"/>
         <w:ind w:left="540" w:hanging="271"/>
       </w:pPr>
       <w:r>
@@ -1436,7 +1436,7 @@
     <w:p>
       <w:pPr>
         <w:pStyle w:val="ListBullet"/>
-        <w:spacing w:after="80" w:line="300" w:lineRule="auto"/>
+        <w:spacing w:after="40" w:line="276" w:lineRule="auto"/>
         <w:ind w:left="540" w:hanging="271"/>
       </w:pPr>
       <w:r>
@@ -1450,7 +1450,7 @@
     <w:p>
       <w:pPr>
         <w:pStyle w:val="ListBullet"/>
-        <w:spacing w:after="80" w:line="300" w:lineRule="auto"/>
+        <w:spacing w:after="40" w:line="276" w:lineRule="auto"/>
         <w:ind w:left="540" w:hanging="271"/>
       </w:pPr>
       <w:r>
@@ -1464,7 +1464,7 @@
     <w:p>
       <w:pPr>
         <w:pStyle w:val="ListBullet"/>
-        <w:spacing w:after="80" w:line="300" w:lineRule="auto"/>
+        <w:spacing w:after="40" w:line="276" w:lineRule="auto"/>
         <w:ind w:left="540" w:hanging="271"/>
       </w:pPr>
       <w:r>
@@ -1486,7 +1486,7 @@
     <w:p>
       <w:pPr>
         <w:pStyle w:val="ListBullet"/>
-        <w:spacing w:after="80" w:line="300" w:lineRule="auto"/>
+        <w:spacing w:after="40" w:line="276" w:lineRule="auto"/>
         <w:ind w:left="540" w:hanging="271"/>
       </w:pPr>
       <w:r>
@@ -1500,7 +1500,7 @@
     <w:p>
       <w:pPr>
         <w:pStyle w:val="ListBullet"/>
-        <w:spacing w:after="80" w:line="300" w:lineRule="auto"/>
+        <w:spacing w:after="40" w:line="276" w:lineRule="auto"/>
         <w:ind w:left="540" w:hanging="271"/>
       </w:pPr>
       <w:r>
@@ -1514,7 +1514,7 @@
     <w:p>
       <w:pPr>
         <w:pStyle w:val="ListBullet"/>
-        <w:spacing w:after="80" w:line="300" w:lineRule="auto"/>
+        <w:spacing w:after="40" w:line="276" w:lineRule="auto"/>
         <w:ind w:left="540" w:hanging="271"/>
       </w:pPr>
       <w:r>
@@ -1536,7 +1536,7 @@
     <w:p>
       <w:pPr>
         <w:pStyle w:val="ListBullet"/>
-        <w:spacing w:after="80" w:line="300" w:lineRule="auto"/>
+        <w:spacing w:after="40" w:line="276" w:lineRule="auto"/>
         <w:ind w:left="540" w:hanging="271"/>
       </w:pPr>
       <w:r>
@@ -1550,7 +1550,7 @@
     <w:p>
       <w:pPr>
         <w:pStyle w:val="ListBullet"/>
-        <w:spacing w:after="80" w:line="300" w:lineRule="auto"/>
+        <w:spacing w:after="40" w:line="276" w:lineRule="auto"/>
         <w:ind w:left="540" w:hanging="271"/>
       </w:pPr>
       <w:r>
@@ -1564,7 +1564,7 @@
     <w:p>
       <w:pPr>
         <w:pStyle w:val="ListBullet"/>
-        <w:spacing w:after="80" w:line="300" w:lineRule="auto"/>
+        <w:spacing w:after="40" w:line="276" w:lineRule="auto"/>
         <w:ind w:left="540" w:hanging="271"/>
       </w:pPr>
       <w:r>
@@ -1578,7 +1578,7 @@
     <w:p>
       <w:pPr>
         <w:pStyle w:val="ListBullet"/>
-        <w:spacing w:after="80" w:line="300" w:lineRule="auto"/>
+        <w:spacing w:after="40" w:line="276" w:lineRule="auto"/>
         <w:ind w:left="540" w:hanging="271"/>
       </w:pPr>
       <w:r>
@@ -1591,14 +1591,14 @@
     </w:p>
     <w:p>
       <w:pPr>
-        <w:spacing w:before="160"/>
+        <w:spacing w:before="80"/>
       </w:pPr>
       <w:r>
         <w:rPr>
           <w:rFonts w:ascii="Calibri" w:hAnsi="Calibri"/>
           <w:b/>
           <w:color w:val="1F4D78"/>
-          <w:sz w:val="20"/>
+          <w:sz w:val="19"/>
         </w:rPr>
         <w:t>Review status: queued for collaborative review</w:t>
       </w:r>
@@ -1619,7 +1619,7 @@
     </w:p>
     <w:p>
       <w:pPr>
-        <w:spacing w:before="80" w:after="200" w:line="288" w:lineRule="auto"/>
+        <w:spacing w:before="40" w:after="120" w:line="264" w:lineRule="auto"/>
         <w:ind w:left="173" w:right="173"/>
         <w:shd w:fill="E8EEF5"/>
         <w:pBdr>
@@ -1631,7 +1631,7 @@
           <w:rFonts w:ascii="Calibri" w:hAnsi="Calibri"/>
           <w:b/>
           <w:color w:val="1F4D78"/>
-          <w:sz w:val="22"/>
+          <w:sz w:val="20"/>
         </w:rPr>
         <w:t xml:space="preserve">Initial verdict: </w:t>
       </w:r>
@@ -1639,7 +1639,7 @@
         <w:rPr>
           <w:rFonts w:ascii="Calibri" w:hAnsi="Calibri"/>
           <w:color w:val="0B2545"/>
-          <w:sz w:val="22"/>
+          <w:sz w:val="20"/>
         </w:rPr>
         <w:t>The main flow and post-share area now have the right structure. Remaining work is largely completed-state hierarchy and copy economy.</w:t>
       </w:r>
@@ -1652,7 +1652,7 @@
       <w:r>
         <w:drawing>
           <wp:inline xmlns:a="http://schemas.openxmlformats.org/drawingml/2006/main" xmlns:pic="http://schemas.openxmlformats.org/drawingml/2006/picture">
-            <wp:extent cx="5623560" cy="4306801"/>
+            <wp:extent cx="4572000" cy="3501464"/>
             <wp:docPr id="5" name="Picture 5" descr="Sandbox screenshot of assignment builder step 5, Review &amp; share." title="Current sandbox baseline - Step 5: Review &amp; share"/>
             <wp:cNvGraphicFramePr>
               <a:graphicFrameLocks noChangeAspect="1"/>
@@ -1673,7 +1673,7 @@
                   <pic:spPr>
                     <a:xfrm>
                       <a:off x="0" y="0"/>
-                      <a:ext cx="5623560" cy="4306801"/>
+                      <a:ext cx="4572000" cy="3501464"/>
                     </a:xfrm>
                     <a:prstGeom prst="rect"/>
                   </pic:spPr>
@@ -1686,7 +1686,7 @@
     </w:p>
     <w:p>
       <w:pPr>
-        <w:spacing w:after="160"/>
+        <w:spacing w:after="80"/>
         <w:jc w:val="center"/>
       </w:pPr>
       <w:r>
@@ -1694,7 +1694,7 @@
           <w:rFonts w:ascii="Calibri" w:hAnsi="Calibri"/>
           <w:i/>
           <w:color w:val="5D6B7A"/>
-          <w:sz w:val="18"/>
+          <w:sz w:val="17"/>
         </w:rPr>
         <w:t>Current sandbox baseline - Step 5: Review &amp; share</w:t>
       </w:r>
@@ -1710,7 +1710,7 @@
     <w:p>
       <w:pPr>
         <w:pStyle w:val="ListBullet"/>
-        <w:spacing w:after="80" w:line="300" w:lineRule="auto"/>
+        <w:spacing w:after="40" w:line="276" w:lineRule="auto"/>
         <w:ind w:left="540" w:hanging="271"/>
       </w:pPr>
       <w:r>
@@ -1724,7 +1724,7 @@
     <w:p>
       <w:pPr>
         <w:pStyle w:val="ListBullet"/>
-        <w:spacing w:after="80" w:line="300" w:lineRule="auto"/>
+        <w:spacing w:after="40" w:line="276" w:lineRule="auto"/>
         <w:ind w:left="540" w:hanging="271"/>
       </w:pPr>
       <w:r>
@@ -1738,7 +1738,7 @@
     <w:p>
       <w:pPr>
         <w:pStyle w:val="ListBullet"/>
-        <w:spacing w:after="80" w:line="300" w:lineRule="auto"/>
+        <w:spacing w:after="40" w:line="276" w:lineRule="auto"/>
         <w:ind w:left="540" w:hanging="271"/>
       </w:pPr>
       <w:r>
@@ -1752,7 +1752,7 @@
     <w:p>
       <w:pPr>
         <w:pStyle w:val="ListBullet"/>
-        <w:spacing w:after="80" w:line="300" w:lineRule="auto"/>
+        <w:spacing w:after="40" w:line="276" w:lineRule="auto"/>
         <w:ind w:left="540" w:hanging="271"/>
       </w:pPr>
       <w:r>
@@ -1774,7 +1774,7 @@
     <w:p>
       <w:pPr>
         <w:pStyle w:val="ListBullet"/>
-        <w:spacing w:after="80" w:line="300" w:lineRule="auto"/>
+        <w:spacing w:after="40" w:line="276" w:lineRule="auto"/>
         <w:ind w:left="540" w:hanging="271"/>
       </w:pPr>
       <w:r>
@@ -1788,7 +1788,7 @@
     <w:p>
       <w:pPr>
         <w:pStyle w:val="ListBullet"/>
-        <w:spacing w:after="80" w:line="300" w:lineRule="auto"/>
+        <w:spacing w:after="40" w:line="276" w:lineRule="auto"/>
         <w:ind w:left="540" w:hanging="271"/>
       </w:pPr>
       <w:r>
@@ -1802,7 +1802,7 @@
     <w:p>
       <w:pPr>
         <w:pStyle w:val="ListBullet"/>
-        <w:spacing w:after="80" w:line="300" w:lineRule="auto"/>
+        <w:spacing w:after="40" w:line="276" w:lineRule="auto"/>
         <w:ind w:left="540" w:hanging="271"/>
       </w:pPr>
       <w:r>
@@ -1824,7 +1824,7 @@
     <w:p>
       <w:pPr>
         <w:pStyle w:val="ListBullet"/>
-        <w:spacing w:after="80" w:line="300" w:lineRule="auto"/>
+        <w:spacing w:after="40" w:line="276" w:lineRule="auto"/>
         <w:ind w:left="540" w:hanging="271"/>
       </w:pPr>
       <w:r>
@@ -1838,7 +1838,7 @@
     <w:p>
       <w:pPr>
         <w:pStyle w:val="ListBullet"/>
-        <w:spacing w:after="80" w:line="300" w:lineRule="auto"/>
+        <w:spacing w:after="40" w:line="276" w:lineRule="auto"/>
         <w:ind w:left="540" w:hanging="271"/>
       </w:pPr>
       <w:r>
@@ -1852,7 +1852,7 @@
     <w:p>
       <w:pPr>
         <w:pStyle w:val="ListBullet"/>
-        <w:spacing w:after="80" w:line="300" w:lineRule="auto"/>
+        <w:spacing w:after="40" w:line="276" w:lineRule="auto"/>
         <w:ind w:left="540" w:hanging="271"/>
       </w:pPr>
       <w:r>
@@ -1866,7 +1866,7 @@
     <w:p>
       <w:pPr>
         <w:pStyle w:val="ListBullet"/>
-        <w:spacing w:after="80" w:line="300" w:lineRule="auto"/>
+        <w:spacing w:after="40" w:line="276" w:lineRule="auto"/>
         <w:ind w:left="540" w:hanging="271"/>
       </w:pPr>
       <w:r>
@@ -1879,14 +1879,14 @@
     </w:p>
     <w:p>
       <w:pPr>
-        <w:spacing w:before="160"/>
+        <w:spacing w:before="80"/>
       </w:pPr>
       <w:r>
         <w:rPr>
           <w:rFonts w:ascii="Calibri" w:hAnsi="Calibri"/>
           <w:b/>
           <w:color w:val="1F4D78"/>
-          <w:sz w:val="20"/>
+          <w:sz w:val="19"/>
         </w:rPr>
         <w:t>Review status: queued for collaborative review</w:t>
       </w:r>
@@ -1912,7 +1912,7 @@
       <w:r>
         <w:drawing>
           <wp:inline xmlns:a="http://schemas.openxmlformats.org/drawingml/2006/main" xmlns:pic="http://schemas.openxmlformats.org/drawingml/2006/picture">
-            <wp:extent cx="5623560" cy="4306801"/>
+            <wp:extent cx="4572000" cy="3501464"/>
             <wp:docPr id="6" name="Picture 6" descr="Sandbox screenshot of the Advanced actions card below the Review and share footer." title="Current sandbox baseline - Advanced actions after successful sharing"/>
             <wp:cNvGraphicFramePr>
               <a:graphicFrameLocks noChangeAspect="1"/>
@@ -1933,7 +1933,7 @@
                   <pic:spPr>
                     <a:xfrm>
                       <a:off x="0" y="0"/>
-                      <a:ext cx="5623560" cy="4306801"/>
+                      <a:ext cx="4572000" cy="3501464"/>
                     </a:xfrm>
                     <a:prstGeom prst="rect"/>
                   </pic:spPr>
@@ -1946,7 +1946,7 @@
     </w:p>
     <w:p>
       <w:pPr>
-        <w:spacing w:after="160"/>
+        <w:spacing w:after="80"/>
         <w:jc w:val="center"/>
       </w:pPr>
       <w:r>
@@ -1954,7 +1954,7 @@
           <w:rFonts w:ascii="Calibri" w:hAnsi="Calibri"/>
           <w:i/>
           <w:color w:val="5D6B7A"/>
-          <w:sz w:val="18"/>
+          <w:sz w:val="17"/>
         </w:rPr>
         <w:t>Current sandbox baseline - Advanced actions after successful sharing</w:t>
       </w:r>
@@ -1970,7 +1970,7 @@
     <w:p>
       <w:pPr>
         <w:pStyle w:val="ListBullet"/>
-        <w:spacing w:after="80" w:line="300" w:lineRule="auto"/>
+        <w:spacing w:after="40" w:line="276" w:lineRule="auto"/>
         <w:ind w:left="540" w:hanging="271"/>
       </w:pPr>
       <w:r>
@@ -1984,7 +1984,7 @@
     <w:p>
       <w:pPr>
         <w:pStyle w:val="ListBullet"/>
-        <w:spacing w:after="80" w:line="300" w:lineRule="auto"/>
+        <w:spacing w:after="40" w:line="276" w:lineRule="auto"/>
         <w:ind w:left="540" w:hanging="271"/>
       </w:pPr>
       <w:r>
@@ -1998,7 +1998,7 @@
     <w:p>
       <w:pPr>
         <w:pStyle w:val="ListBullet"/>
-        <w:spacing w:after="80" w:line="300" w:lineRule="auto"/>
+        <w:spacing w:after="40" w:line="276" w:lineRule="auto"/>
         <w:ind w:left="540" w:hanging="271"/>
       </w:pPr>
       <w:r>
@@ -2012,7 +2012,7 @@
     <w:p>
       <w:pPr>
         <w:pStyle w:val="ListBullet"/>
-        <w:spacing w:after="80" w:line="300" w:lineRule="auto"/>
+        <w:spacing w:after="40" w:line="276" w:lineRule="auto"/>
         <w:ind w:left="540" w:hanging="271"/>
       </w:pPr>
       <w:r>
@@ -2034,7 +2034,7 @@
     <w:p>
       <w:pPr>
         <w:pStyle w:val="ListBullet"/>
-        <w:spacing w:after="80" w:line="300" w:lineRule="auto"/>
+        <w:spacing w:after="40" w:line="276" w:lineRule="auto"/>
         <w:ind w:left="540" w:hanging="271"/>
       </w:pPr>
       <w:r>
@@ -2048,7 +2048,7 @@
     <w:p>
       <w:pPr>
         <w:pStyle w:val="ListBullet"/>
-        <w:spacing w:after="80" w:line="300" w:lineRule="auto"/>
+        <w:spacing w:after="40" w:line="276" w:lineRule="auto"/>
         <w:ind w:left="540" w:hanging="271"/>
       </w:pPr>
       <w:r>
@@ -2062,7 +2062,7 @@
     <w:p>
       <w:pPr>
         <w:pStyle w:val="ListBullet"/>
-        <w:spacing w:after="80" w:line="300" w:lineRule="auto"/>
+        <w:spacing w:after="40" w:line="276" w:lineRule="auto"/>
         <w:ind w:left="540" w:hanging="271"/>
       </w:pPr>
       <w:r>
@@ -2076,7 +2076,7 @@
     <w:p>
       <w:pPr>
         <w:pStyle w:val="ListBullet"/>
-        <w:spacing w:after="80" w:line="300" w:lineRule="auto"/>
+        <w:spacing w:after="40" w:line="276" w:lineRule="auto"/>
         <w:ind w:left="540" w:hanging="271"/>
       </w:pPr>
       <w:r>
@@ -2097,7 +2097,7 @@
     </w:p>
     <w:p>
       <w:pPr>
-        <w:spacing w:before="80" w:after="200" w:line="288" w:lineRule="auto"/>
+        <w:spacing w:before="40" w:after="120" w:line="264" w:lineRule="auto"/>
         <w:ind w:left="173" w:right="173"/>
         <w:shd w:fill="F2F4F7"/>
         <w:pBdr>
@@ -2109,7 +2109,7 @@
           <w:rFonts w:ascii="Calibri" w:hAnsi="Calibri"/>
           <w:b/>
           <w:color w:val="1F4D78"/>
-          <w:sz w:val="22"/>
+          <w:sz w:val="20"/>
         </w:rPr>
         <w:t xml:space="preserve">How to use this section: </w:t>
       </w:r>
@@ -2117,7 +2117,7 @@
         <w:rPr>
           <w:rFonts w:ascii="Calibri" w:hAnsi="Calibri"/>
           <w:color w:val="0B2545"/>
-          <w:sz w:val="22"/>
+          <w:sz w:val="20"/>
         </w:rPr>
         <w:t>After each collaborative step review, record the accepted visual changes, explicit non-changes, and evidence used to approve the result.</w:t>
       </w:r>
@@ -2133,7 +2133,7 @@
     <w:p>
       <w:pPr>
         <w:pStyle w:val="ListBullet"/>
-        <w:spacing w:after="80" w:line="300" w:lineRule="auto"/>
+        <w:spacing w:after="40" w:line="276" w:lineRule="auto"/>
         <w:ind w:left="540" w:hanging="271"/>
       </w:pPr>
       <w:r>
@@ -2147,7 +2147,7 @@
     <w:p>
       <w:pPr>
         <w:pStyle w:val="ListBullet"/>
-        <w:spacing w:after="80" w:line="300" w:lineRule="auto"/>
+        <w:spacing w:after="40" w:line="276" w:lineRule="auto"/>
         <w:ind w:left="540" w:hanging="271"/>
       </w:pPr>
       <w:r>
@@ -2161,7 +2161,7 @@
     <w:p>
       <w:pPr>
         <w:pStyle w:val="ListBullet"/>
-        <w:spacing w:after="80" w:line="300" w:lineRule="auto"/>
+        <w:spacing w:after="40" w:line="276" w:lineRule="auto"/>
         <w:ind w:left="540" w:hanging="271"/>
       </w:pPr>
       <w:r>
@@ -2183,7 +2183,7 @@
     <w:p>
       <w:pPr>
         <w:pStyle w:val="ListBullet"/>
-        <w:spacing w:after="80" w:line="300" w:lineRule="auto"/>
+        <w:spacing w:after="40" w:line="276" w:lineRule="auto"/>
         <w:ind w:left="540" w:hanging="271"/>
       </w:pPr>
       <w:r>
@@ -2197,7 +2197,7 @@
     <w:p>
       <w:pPr>
         <w:pStyle w:val="ListBullet"/>
-        <w:spacing w:after="80" w:line="300" w:lineRule="auto"/>
+        <w:spacing w:after="40" w:line="276" w:lineRule="auto"/>
         <w:ind w:left="540" w:hanging="271"/>
       </w:pPr>
       <w:r>
@@ -2211,7 +2211,7 @@
     <w:p>
       <w:pPr>
         <w:pStyle w:val="ListBullet"/>
-        <w:spacing w:after="80" w:line="300" w:lineRule="auto"/>
+        <w:spacing w:after="40" w:line="276" w:lineRule="auto"/>
         <w:ind w:left="540" w:hanging="271"/>
       </w:pPr>
       <w:r>
@@ -2233,7 +2233,7 @@
     <w:p>
       <w:pPr>
         <w:pStyle w:val="ListBullet"/>
-        <w:spacing w:after="80" w:line="300" w:lineRule="auto"/>
+        <w:spacing w:after="40" w:line="276" w:lineRule="auto"/>
         <w:ind w:left="540" w:hanging="271"/>
       </w:pPr>
       <w:r>
@@ -2247,7 +2247,7 @@
     <w:p>
       <w:pPr>
         <w:pStyle w:val="ListBullet"/>
-        <w:spacing w:after="80" w:line="300" w:lineRule="auto"/>
+        <w:spacing w:after="40" w:line="276" w:lineRule="auto"/>
         <w:ind w:left="540" w:hanging="271"/>
       </w:pPr>
       <w:r>
@@ -2261,7 +2261,7 @@
     <w:p>
       <w:pPr>
         <w:pStyle w:val="ListBullet"/>
-        <w:spacing w:after="80" w:line="300" w:lineRule="auto"/>
+        <w:spacing w:after="40" w:line="276" w:lineRule="auto"/>
         <w:ind w:left="540" w:hanging="271"/>
       </w:pPr>
       <w:r>
@@ -2283,7 +2283,7 @@
     <w:p>
       <w:pPr>
         <w:pStyle w:val="ListBullet"/>
-        <w:spacing w:after="80" w:line="300" w:lineRule="auto"/>
+        <w:spacing w:after="40" w:line="276" w:lineRule="auto"/>
         <w:ind w:left="540" w:hanging="271"/>
       </w:pPr>
       <w:r>
@@ -2297,7 +2297,7 @@
     <w:p>
       <w:pPr>
         <w:pStyle w:val="ListBullet"/>
-        <w:spacing w:after="80" w:line="300" w:lineRule="auto"/>
+        <w:spacing w:after="40" w:line="276" w:lineRule="auto"/>
         <w:ind w:left="540" w:hanging="271"/>
       </w:pPr>
       <w:r>
@@ -2311,7 +2311,7 @@
     <w:p>
       <w:pPr>
         <w:pStyle w:val="ListBullet"/>
-        <w:spacing w:after="80" w:line="300" w:lineRule="auto"/>
+        <w:spacing w:after="40" w:line="276" w:lineRule="auto"/>
         <w:ind w:left="540" w:hanging="271"/>
       </w:pPr>
       <w:r>
@@ -2333,7 +2333,7 @@
     <w:p>
       <w:pPr>
         <w:pStyle w:val="ListBullet"/>
-        <w:spacing w:after="80" w:line="300" w:lineRule="auto"/>
+        <w:spacing w:after="40" w:line="276" w:lineRule="auto"/>
         <w:ind w:left="540" w:hanging="271"/>
       </w:pPr>
       <w:r>
@@ -2347,7 +2347,7 @@
     <w:p>
       <w:pPr>
         <w:pStyle w:val="ListBullet"/>
-        <w:spacing w:after="80" w:line="300" w:lineRule="auto"/>
+        <w:spacing w:after="40" w:line="276" w:lineRule="auto"/>
         <w:ind w:left="540" w:hanging="271"/>
       </w:pPr>
       <w:r>
@@ -2361,7 +2361,7 @@
     <w:p>
       <w:pPr>
         <w:pStyle w:val="ListBullet"/>
-        <w:spacing w:after="80" w:line="300" w:lineRule="auto"/>
+        <w:spacing w:after="40" w:line="276" w:lineRule="auto"/>
         <w:ind w:left="540" w:hanging="271"/>
       </w:pPr>
       <w:r>
@@ -2383,7 +2383,7 @@
     <w:p>
       <w:pPr>
         <w:pStyle w:val="ListBullet"/>
-        <w:spacing w:after="80" w:line="300" w:lineRule="auto"/>
+        <w:spacing w:after="40" w:line="276" w:lineRule="auto"/>
         <w:ind w:left="540" w:hanging="271"/>
       </w:pPr>
       <w:r>
@@ -2397,7 +2397,7 @@
     <w:p>
       <w:pPr>
         <w:pStyle w:val="ListBullet"/>
-        <w:spacing w:after="80" w:line="300" w:lineRule="auto"/>
+        <w:spacing w:after="40" w:line="276" w:lineRule="auto"/>
         <w:ind w:left="540" w:hanging="271"/>
       </w:pPr>
       <w:r>
@@ -2411,7 +2411,7 @@
     <w:p>
       <w:pPr>
         <w:pStyle w:val="ListBullet"/>
-        <w:spacing w:after="80" w:line="300" w:lineRule="auto"/>
+        <w:spacing w:after="40" w:line="276" w:lineRule="auto"/>
         <w:ind w:left="540" w:hanging="271"/>
       </w:pPr>
       <w:r>
@@ -2839,12 +2839,12 @@
     <w:qFormat/>
     <w:rsid w:val="00FC693F"/>
     <w:pPr>
-      <w:spacing w:after="120" w:line="300" w:lineRule="auto"/>
+      <w:spacing w:after="80" w:line="276" w:lineRule="auto"/>
     </w:pPr>
     <w:rPr>
       <w:rFonts w:ascii="Calibri" w:hAnsi="Calibri"/>
       <w:color w:val="0B2545"/>
-      <w:sz w:val="22"/>
+      <w:sz w:val="20"/>
     </w:rPr>
   </w:style>
   <w:style w:type="paragraph" w:styleId="Header">
@@ -2902,7 +2902,7 @@
     <w:pPr>
       <w:keepNext/>
       <w:keepLines/>
-      <w:spacing w:before="360" w:after="200"/>
+      <w:spacing w:before="240" w:after="120"/>
       <w:outlineLvl w:val="0"/>
     </w:pPr>
     <w:rPr>
@@ -2910,7 +2910,7 @@
       <w:b/>
       <w:bCs/>
       <w:color w:val="2E74B5"/>
-      <w:sz w:val="32"/>
+      <w:sz w:val="30"/>
       <w:szCs w:val="28"/>
     </w:rPr>
   </w:style>
@@ -2926,7 +2926,7 @@
     <w:pPr>
       <w:keepNext/>
       <w:keepLines/>
-      <w:spacing w:before="280" w:after="140"/>
+      <w:spacing w:before="160" w:after="80"/>
       <w:outlineLvl w:val="1"/>
     </w:pPr>
     <w:rPr>
@@ -2934,7 +2934,7 @@
       <w:b/>
       <w:bCs/>
       <w:color w:val="2E74B5"/>
-      <w:sz w:val="26"/>
+      <w:sz w:val="24"/>
       <w:szCs w:val="26"/>
     </w:rPr>
   </w:style>
@@ -2950,7 +2950,7 @@
     <w:pPr>
       <w:keepNext/>
       <w:keepLines/>
-      <w:spacing w:before="200" w:after="100"/>
+      <w:spacing w:before="140" w:after="60"/>
       <w:outlineLvl w:val="2"/>
     </w:pPr>
     <w:rPr>
@@ -2958,7 +2958,7 @@
       <w:b/>
       <w:bCs/>
       <w:color w:val="1F4D78"/>
-      <w:sz w:val="24"/>
+      <w:sz w:val="22"/>
     </w:rPr>
   </w:style>
   <w:style w:type="paragraph" w:styleId="Heading4">
@@ -3374,13 +3374,13 @@
       <w:numPr>
         <w:numId w:val="1"/>
       </w:numPr>
-      <w:spacing w:after="80" w:line="300" w:lineRule="auto"/>
+      <w:spacing w:after="40" w:line="276" w:lineRule="auto"/>
       <w:contextualSpacing/>
     </w:pPr>
     <w:rPr>
       <w:rFonts w:ascii="Calibri" w:hAnsi="Calibri"/>
       <w:color w:val="0B2545"/>
-      <w:sz w:val="22"/>
+      <w:sz w:val="20"/>
     </w:rPr>
   </w:style>
   <w:style w:type="paragraph" w:styleId="ListBullet2">
@@ -3419,13 +3419,13 @@
       <w:numPr>
         <w:numId w:val="5"/>
       </w:numPr>
-      <w:spacing w:after="80" w:line="300" w:lineRule="auto"/>
+      <w:spacing w:after="40" w:line="276" w:lineRule="auto"/>
       <w:contextualSpacing/>
     </w:pPr>
     <w:rPr>
       <w:rFonts w:ascii="Calibri" w:hAnsi="Calibri"/>
       <w:color w:val="0B2545"/>
-      <w:sz w:val="22"/>
+      <w:sz w:val="20"/>
     </w:rPr>
   </w:style>
   <w:style w:type="paragraph" w:styleId="ListNumber2">

</xml_diff>